<commit_message>
Upgrade PRD to v1.1 and TRD to v1.1 — build-ready field specs, ERD, API contract, RLS, state machine, pilot gates
</commit_message>
<xml_diff>
--- a/ROE - PRD.docx
+++ b/ROE - PRD.docx
@@ -93,53 +93,11 @@
         </w:rPr>
       </w:pPr>
       <w:r>
-        <w:rPr>
-          <w:rFonts w:ascii="Times New Roman" w:eastAsia="Times New Roman" w:hAnsi="Times New Roman" w:cs="Times New Roman"/>
-          <w:b/>
-          <w:bCs/>
-          <w:kern w:val="0"/>
-          <w:lang w:eastAsia="en-GB"/>
-          <w14:ligatures w14:val="none"/>
-        </w:rPr>
-        <w:t>Version:</w:t>
-      </w:r>
-      <w:r>
-        <w:rPr>
-          <w:rFonts w:ascii="Times New Roman" w:eastAsia="Times New Roman" w:hAnsi="Times New Roman" w:cs="Times New Roman"/>
-          <w:kern w:val="0"/>
-          <w:lang w:eastAsia="en-GB"/>
-          <w14:ligatures w14:val="none"/>
-        </w:rPr>
-        <w:t xml:space="preserve"> 1.0 — Consolidated baseline</w:t>
-      </w:r>
-      <w:r>
-        <w:rPr>
-          <w:rFonts w:ascii="Times New Roman" w:eastAsia="Times New Roman" w:hAnsi="Times New Roman" w:cs="Times New Roman"/>
-          <w:kern w:val="0"/>
-          <w:lang w:eastAsia="en-GB"/>
-          <w14:ligatures w14:val="none"/>
-        </w:rPr>
+        <w:t>Version: 1.1 — Build-ready update</w:t>
         <w:br/>
-      </w:r>
-      <w:r>
-        <w:rPr>
-          <w:rFonts w:ascii="Times New Roman" w:eastAsia="Times New Roman" w:hAnsi="Times New Roman" w:cs="Times New Roman"/>
-          <w:b/>
-          <w:bCs/>
-          <w:kern w:val="0"/>
-          <w:lang w:eastAsia="en-GB"/>
-          <w14:ligatures w14:val="none"/>
-        </w:rPr>
-        <w:t>Date:</w:t>
-      </w:r>
-      <w:r>
-        <w:rPr>
-          <w:rFonts w:ascii="Times New Roman" w:eastAsia="Times New Roman" w:hAnsi="Times New Roman" w:cs="Times New Roman"/>
-          <w:kern w:val="0"/>
-          <w:lang w:eastAsia="en-GB"/>
-          <w14:ligatures w14:val="none"/>
-        </w:rPr>
-        <w:t xml:space="preserve"> 8 October 2026</w:t>
+        <w:t>Date: 9 October 2026</w:t>
+        <w:br/>
+        <w:t>Changelog v1.0→v1.1: added field specs, user stories + acceptance, quantified targets + pilot exit, member self-service definition, pricing test, canonical journey + frame map, permission matrix. No change to MVP promise.</w:t>
       </w:r>
     </w:p>
     <w:p>
@@ -6517,6 +6475,1951 @@
       </w:r>
     </w:p>
     <w:p/>
+    <w:p>
+      <w:pPr>
+        <w:pStyle w:val="Heading1"/>
+      </w:pPr>
+      <w:r>
+        <w:t>17. Field-Level Specification (Build-ready)</w:t>
+      </w:r>
+    </w:p>
+    <w:p>
+      <w:r>
+        <w:t>Rule: required-only at capture. Everything else progressive. Dirty contact data was the #1 survey pain (6/12 incomplete/incorrect). Validation is mandatory.</w:t>
+      </w:r>
+    </w:p>
+    <w:tbl>
+      <w:tblPr>
+        <w:tblW w:type="auto" w:w="0"/>
+        <w:tblLook w:firstColumn="1" w:firstRow="1" w:lastColumn="0" w:lastRow="0" w:noHBand="0" w:noVBand="1" w:val="04A0"/>
+      </w:tblPr>
+      <w:tblGrid>
+        <w:gridCol w:w="3009"/>
+        <w:gridCol w:w="3009"/>
+        <w:gridCol w:w="3009"/>
+      </w:tblGrid>
+      <w:tr>
+        <w:tc>
+          <w:tcPr>
+            <w:tcW w:type="dxa" w:w="3009"/>
+          </w:tcPr>
+          <w:p>
+            <w:r>
+              <w:t>Entity / Field</w:t>
+            </w:r>
+          </w:p>
+        </w:tc>
+        <w:tc>
+          <w:tcPr>
+            <w:tcW w:type="dxa" w:w="3009"/>
+          </w:tcPr>
+          <w:p>
+            <w:r>
+              <w:t>Required</w:t>
+            </w:r>
+          </w:p>
+        </w:tc>
+        <w:tc>
+          <w:tcPr>
+            <w:tcW w:type="dxa" w:w="3009"/>
+          </w:tcPr>
+          <w:p>
+            <w:r>
+              <w:t>Validation</w:t>
+            </w:r>
+          </w:p>
+        </w:tc>
+      </w:tr>
+      <w:tr>
+        <w:tc>
+          <w:tcPr>
+            <w:tcW w:type="dxa" w:w="3009"/>
+          </w:tcPr>
+          <w:p>
+            <w:r>
+              <w:t>Person.first_name</w:t>
+            </w:r>
+          </w:p>
+        </w:tc>
+        <w:tc>
+          <w:tcPr>
+            <w:tcW w:type="dxa" w:w="3009"/>
+          </w:tcPr>
+          <w:p>
+            <w:r>
+              <w:t>Yes</w:t>
+            </w:r>
+          </w:p>
+        </w:tc>
+        <w:tc>
+          <w:tcPr>
+            <w:tcW w:type="dxa" w:w="3009"/>
+          </w:tcPr>
+          <w:p>
+            <w:r>
+              <w:t>2-60 chars, trim</w:t>
+            </w:r>
+          </w:p>
+        </w:tc>
+      </w:tr>
+      <w:tr>
+        <w:tc>
+          <w:tcPr>
+            <w:tcW w:type="dxa" w:w="3009"/>
+          </w:tcPr>
+          <w:p>
+            <w:r>
+              <w:t>Person.phone</w:t>
+            </w:r>
+          </w:p>
+        </w:tc>
+        <w:tc>
+          <w:tcPr>
+            <w:tcW w:type="dxa" w:w="3009"/>
+          </w:tcPr>
+          <w:p>
+            <w:r>
+              <w:t>Yes</w:t>
+            </w:r>
+          </w:p>
+        </w:tc>
+        <w:tc>
+          <w:tcPr>
+            <w:tcW w:type="dxa" w:w="3009"/>
+          </w:tcPr>
+          <w:p>
+            <w:r>
+              <w:t>7-15 digits, allow +/spaces; duplicate check per org; flag possible duplicate</w:t>
+            </w:r>
+          </w:p>
+        </w:tc>
+      </w:tr>
+      <w:tr>
+        <w:tc>
+          <w:tcPr>
+            <w:tcW w:type="dxa" w:w="3009"/>
+          </w:tcPr>
+          <w:p>
+            <w:r>
+              <w:t>Person.preferred_channel</w:t>
+            </w:r>
+          </w:p>
+        </w:tc>
+        <w:tc>
+          <w:tcPr>
+            <w:tcW w:type="dxa" w:w="3009"/>
+          </w:tcPr>
+          <w:p>
+            <w:r>
+              <w:t>Yes</w:t>
+            </w:r>
+          </w:p>
+        </w:tc>
+        <w:tc>
+          <w:tcPr>
+            <w:tcW w:type="dxa" w:w="3009"/>
+          </w:tcPr>
+          <w:p>
+            <w:r>
+              <w:t>Enum: Call | WhatsApp | Visit | Other</w:t>
+            </w:r>
+          </w:p>
+        </w:tc>
+      </w:tr>
+      <w:tr>
+        <w:tc>
+          <w:tcPr>
+            <w:tcW w:type="dxa" w:w="3009"/>
+          </w:tcPr>
+          <w:p>
+            <w:r>
+              <w:t>Person.interests</w:t>
+            </w:r>
+          </w:p>
+        </w:tc>
+        <w:tc>
+          <w:tcPr>
+            <w:tcW w:type="dxa" w:w="3009"/>
+          </w:tcPr>
+          <w:p>
+            <w:r>
+              <w:t>No</w:t>
+            </w:r>
+          </w:p>
+        </w:tc>
+        <w:tc>
+          <w:tcPr>
+            <w:tcW w:type="dxa" w:w="3009"/>
+          </w:tcPr>
+          <w:p>
+            <w:r>
+              <w:t>Free text max 280 chars</w:t>
+            </w:r>
+          </w:p>
+        </w:tc>
+      </w:tr>
+      <w:tr>
+        <w:tc>
+          <w:tcPr>
+            <w:tcW w:type="dxa" w:w="3009"/>
+          </w:tcPr>
+          <w:p>
+            <w:r>
+              <w:t>Person.how_connected</w:t>
+            </w:r>
+          </w:p>
+        </w:tc>
+        <w:tc>
+          <w:tcPr>
+            <w:tcW w:type="dxa" w:w="3009"/>
+          </w:tcPr>
+          <w:p>
+            <w:r>
+              <w:t>No</w:t>
+            </w:r>
+          </w:p>
+        </w:tc>
+        <w:tc>
+          <w:tcPr>
+            <w:tcW w:type="dxa" w:w="3009"/>
+          </w:tcPr>
+          <w:p>
+            <w:r>
+              <w:t>Enum + free text</w:t>
+            </w:r>
+          </w:p>
+        </w:tc>
+      </w:tr>
+      <w:tr>
+        <w:tc>
+          <w:tcPr>
+            <w:tcW w:type="dxa" w:w="3009"/>
+          </w:tcPr>
+          <w:p>
+            <w:r>
+              <w:t>Person.consent_contact</w:t>
+            </w:r>
+          </w:p>
+        </w:tc>
+        <w:tc>
+          <w:tcPr>
+            <w:tcW w:type="dxa" w:w="3009"/>
+          </w:tcPr>
+          <w:p>
+            <w:r>
+              <w:t>Yes</w:t>
+            </w:r>
+          </w:p>
+        </w:tc>
+        <w:tc>
+          <w:tcPr>
+            <w:tcW w:type="dxa" w:w="3009"/>
+          </w:tcPr>
+          <w:p>
+            <w:r>
+              <w:t>Boolean + timestamp + actor; block save until recorded</w:t>
+            </w:r>
+          </w:p>
+        </w:tc>
+      </w:tr>
+      <w:tr>
+        <w:tc>
+          <w:tcPr>
+            <w:tcW w:type="dxa" w:w="3009"/>
+          </w:tcPr>
+          <w:p>
+            <w:r>
+              <w:t>Action.assignee</w:t>
+            </w:r>
+          </w:p>
+        </w:tc>
+        <w:tc>
+          <w:tcPr>
+            <w:tcW w:type="dxa" w:w="3009"/>
+          </w:tcPr>
+          <w:p>
+            <w:r>
+              <w:t>Yes</w:t>
+            </w:r>
+          </w:p>
+        </w:tc>
+        <w:tc>
+          <w:tcPr>
+            <w:tcW w:type="dxa" w:w="3009"/>
+          </w:tcPr>
+          <w:p>
+            <w:r>
+              <w:t>Active member of same org</w:t>
+            </w:r>
+          </w:p>
+        </w:tc>
+      </w:tr>
+      <w:tr>
+        <w:tc>
+          <w:tcPr>
+            <w:tcW w:type="dxa" w:w="3009"/>
+          </w:tcPr>
+          <w:p>
+            <w:r>
+              <w:t>Action.due_at</w:t>
+            </w:r>
+          </w:p>
+        </w:tc>
+        <w:tc>
+          <w:tcPr>
+            <w:tcW w:type="dxa" w:w="3009"/>
+          </w:tcPr>
+          <w:p>
+            <w:r>
+              <w:t>Yes</w:t>
+            </w:r>
+          </w:p>
+        </w:tc>
+        <w:tc>
+          <w:tcPr>
+            <w:tcW w:type="dxa" w:w="3009"/>
+          </w:tcPr>
+          <w:p>
+            <w:r>
+              <w:t>Date, default +3d, not past at create</w:t>
+            </w:r>
+          </w:p>
+        </w:tc>
+      </w:tr>
+      <w:tr>
+        <w:tc>
+          <w:tcPr>
+            <w:tcW w:type="dxa" w:w="3009"/>
+          </w:tcPr>
+          <w:p>
+            <w:r>
+              <w:t>Action.type</w:t>
+            </w:r>
+          </w:p>
+        </w:tc>
+        <w:tc>
+          <w:tcPr>
+            <w:tcW w:type="dxa" w:w="3009"/>
+          </w:tcPr>
+          <w:p>
+            <w:r>
+              <w:t>Yes</w:t>
+            </w:r>
+          </w:p>
+        </w:tc>
+        <w:tc>
+          <w:tcPr>
+            <w:tcW w:type="dxa" w:w="3009"/>
+          </w:tcPr>
+          <w:p>
+            <w:r>
+              <w:t>Call | WhatsApp | Visit | Intro | Other</w:t>
+            </w:r>
+          </w:p>
+        </w:tc>
+      </w:tr>
+      <w:tr>
+        <w:tc>
+          <w:tcPr>
+            <w:tcW w:type="dxa" w:w="3009"/>
+          </w:tcPr>
+          <w:p>
+            <w:r>
+              <w:t>Action.status</w:t>
+            </w:r>
+          </w:p>
+        </w:tc>
+        <w:tc>
+          <w:tcPr>
+            <w:tcW w:type="dxa" w:w="3009"/>
+          </w:tcPr>
+          <w:p>
+            <w:r>
+              <w:t>System</w:t>
+            </w:r>
+          </w:p>
+        </w:tc>
+        <w:tc>
+          <w:tcPr>
+            <w:tcW w:type="dxa" w:w="3009"/>
+          </w:tcPr>
+          <w:p>
+            <w:r>
+              <w:t>Open | In Progress | Completed | Paused; Overdue derived; server transitions only</w:t>
+            </w:r>
+          </w:p>
+        </w:tc>
+      </w:tr>
+      <w:tr>
+        <w:tc>
+          <w:tcPr>
+            <w:tcW w:type="dxa" w:w="3009"/>
+          </w:tcPr>
+          <w:p>
+            <w:r>
+              <w:t>Interaction.channel</w:t>
+            </w:r>
+          </w:p>
+        </w:tc>
+        <w:tc>
+          <w:tcPr>
+            <w:tcW w:type="dxa" w:w="3009"/>
+          </w:tcPr>
+          <w:p>
+            <w:r>
+              <w:t>Yes</w:t>
+            </w:r>
+          </w:p>
+        </w:tc>
+        <w:tc>
+          <w:tcPr>
+            <w:tcW w:type="dxa" w:w="3009"/>
+          </w:tcPr>
+          <w:p>
+            <w:r>
+              <w:t>Call | WhatsApp | Visit | Other</w:t>
+            </w:r>
+          </w:p>
+        </w:tc>
+      </w:tr>
+      <w:tr>
+        <w:tc>
+          <w:tcPr>
+            <w:tcW w:type="dxa" w:w="3009"/>
+          </w:tcPr>
+          <w:p>
+            <w:r>
+              <w:t>Interaction.outcome</w:t>
+            </w:r>
+          </w:p>
+        </w:tc>
+        <w:tc>
+          <w:tcPr>
+            <w:tcW w:type="dxa" w:w="3009"/>
+          </w:tcPr>
+          <w:p>
+            <w:r>
+              <w:t>Yes</w:t>
+            </w:r>
+          </w:p>
+        </w:tc>
+        <w:tc>
+          <w:tcPr>
+            <w:tcW w:type="dxa" w:w="3009"/>
+          </w:tcPr>
+          <w:p>
+            <w:r>
+              <w:t>Reached | No answer | Call back | Declined | Other + notes max 1000</w:t>
+            </w:r>
+          </w:p>
+        </w:tc>
+      </w:tr>
+      <w:tr>
+        <w:tc>
+          <w:tcPr>
+            <w:tcW w:type="dxa" w:w="3009"/>
+          </w:tcPr>
+          <w:p>
+            <w:r>
+              <w:t>Interaction.next_action</w:t>
+            </w:r>
+          </w:p>
+        </w:tc>
+        <w:tc>
+          <w:tcPr>
+            <w:tcW w:type="dxa" w:w="3009"/>
+          </w:tcPr>
+          <w:p>
+            <w:r>
+              <w:t>Conditional</w:t>
+            </w:r>
+          </w:p>
+        </w:tc>
+        <w:tc>
+          <w:tcPr>
+            <w:tcW w:type="dxa" w:w="3009"/>
+          </w:tcPr>
+          <w:p>
+            <w:r>
+              <w:t>Required unless “No further action + reason” ticked</w:t>
+            </w:r>
+          </w:p>
+        </w:tc>
+      </w:tr>
+      <w:tr>
+        <w:tc>
+          <w:tcPr>
+            <w:tcW w:type="dxa" w:w="3009"/>
+          </w:tcPr>
+          <w:p>
+            <w:r>
+              <w:t>Connection.status</w:t>
+            </w:r>
+          </w:p>
+        </w:tc>
+        <w:tc>
+          <w:tcPr>
+            <w:tcW w:type="dxa" w:w="3009"/>
+          </w:tcPr>
+          <w:p>
+            <w:r>
+              <w:t>System</w:t>
+            </w:r>
+          </w:p>
+        </w:tc>
+        <w:tc>
+          <w:tcPr>
+            <w:tcW w:type="dxa" w:w="3009"/>
+          </w:tcPr>
+          <w:p>
+            <w:r>
+              <w:t>Suggested | Introduced | ParticipationRecorded | Confirmed; honest negative allowed</w:t>
+            </w:r>
+          </w:p>
+        </w:tc>
+      </w:tr>
+    </w:tbl>
+    <w:p/>
+    <w:p>
+      <w:r>
+        <w:rPr>
+          <w:b/>
+        </w:rPr>
+        <w:t xml:space="preserve">Performance: </w:t>
+      </w:r>
+      <w:r>
+        <w:t>Create Person must complete in &lt;2 min on 390px + throttled 3G. Duplicate warning flags, does not block.</w:t>
+      </w:r>
+    </w:p>
+    <w:p>
+      <w:pPr>
+        <w:pStyle w:val="Heading1"/>
+      </w:pPr>
+      <w:r>
+        <w:t>18. User Stories + Per-Feature Acceptance</w:t>
+      </w:r>
+    </w:p>
+    <w:p>
+      <w:r>
+        <w:rPr>
+          <w:b/>
+        </w:rPr>
+        <w:t xml:space="preserve">US-1 Capture: </w:t>
+      </w:r>
+      <w:r>
+        <w:t>As a worker I capture a newcomer in &lt;2 min. Accept: Name+Phone+Channel only required; duplicate flag; consent timestamped; appears in People + Home New within 5s.</w:t>
+      </w:r>
+    </w:p>
+    <w:p>
+      <w:r>
+        <w:rPr>
+          <w:b/>
+        </w:rPr>
+        <w:t xml:space="preserve">US-2 Assign: </w:t>
+      </w:r>
+      <w:r>
+        <w:t>As a worker I assign/see owner + due. Accept: no person without owner &gt;24h hidden — shows in Attention; reassign logs history; &lt;30s to assign.</w:t>
+      </w:r>
+    </w:p>
+    <w:p>
+      <w:r>
+        <w:rPr>
+          <w:b/>
+        </w:rPr>
+        <w:t xml:space="preserve">US-3 Home: </w:t>
+      </w:r>
+      <w:r>
+        <w:t>As a worker I see what needs me today. Accept: Due Today / Overdue / New-no-owner / Pending intro; completing removes it same refresh.</w:t>
+      </w:r>
+    </w:p>
+    <w:p>
+      <w:r>
+        <w:rPr>
+          <w:b/>
+        </w:rPr>
+        <w:t xml:space="preserve">US-4 Record: </w:t>
+      </w:r>
+      <w:r>
+        <w:t>As a worker I log call/WhatsApp/visit + outcome. Accept: channel+outcome required; logging is not connected; failed save shows retry.</w:t>
+      </w:r>
+    </w:p>
+    <w:p>
+      <w:r>
+        <w:rPr>
+          <w:b/>
+        </w:rPr>
+        <w:t xml:space="preserve">US-5 Understand: </w:t>
+      </w:r>
+      <w:r>
+        <w:t>As a worker I record interests + prefs. Accept: editable post-capture; rule-based suggest only in MVP.</w:t>
+      </w:r>
+    </w:p>
+    <w:p>
+      <w:r>
+        <w:rPr>
+          <w:b/>
+        </w:rPr>
+        <w:t xml:space="preserve">US-6 Suggest/Intro: </w:t>
+      </w:r>
+      <w:r>
+        <w:t>As a worker I get a possible group + record handoff. Accept: labelled possibility with reason; intro is not attendance.</w:t>
+      </w:r>
+    </w:p>
+    <w:p>
+      <w:r>
+        <w:rPr>
+          <w:b/>
+        </w:rPr>
+        <w:t xml:space="preserve">US-7 Participation: </w:t>
+      </w:r>
+      <w:r>
+        <w:t>As a leader I record honest outcome. Accept: Confirmed + Not-confirmed + Pending allowed; participation is not belonging.</w:t>
+      </w:r>
+    </w:p>
+    <w:p>
+      <w:r>
+        <w:rPr>
+          <w:b/>
+        </w:rPr>
+        <w:t xml:space="preserve">US-8 Next Action: </w:t>
+      </w:r>
+      <w:r>
+        <w:t>As a worker I set or close next step. Accept: owner+due or No-further-action + reason; no auto tasks.</w:t>
+      </w:r>
+    </w:p>
+    <w:p>
+      <w:r>
+        <w:rPr>
+          <w:b/>
+        </w:rPr>
+        <w:t xml:space="preserve">US-9 Search: </w:t>
+      </w:r>
+      <w:r>
+        <w:t>As a worker I find my people fast. Accept: default Assigned+Shared; org-wide only with grant; Name to Journey to Next shown.</w:t>
+      </w:r>
+    </w:p>
+    <w:p>
+      <w:r>
+        <w:rPr>
+          <w:b/>
+        </w:rPr>
+        <w:t xml:space="preserve">US-10 Notify: </w:t>
+      </w:r>
+      <w:r>
+        <w:t>As a worker I get reminded. Accept: assignment/due/overdue/intro/connection only; no PII in push; no care leak.</w:t>
+      </w:r>
+    </w:p>
+    <w:p>
+      <w:pPr>
+        <w:pStyle w:val="Heading1"/>
+      </w:pPr>
+      <w:r>
+        <w:t>19. Quantified Targets + Pilot Exit Criteria</w:t>
+      </w:r>
+    </w:p>
+    <w:p>
+      <w:r>
+        <w:t>North Star = Meaningful Follow-Up Completion Rate = % due follow-ups with Reached outcome + next action logged within org SLA (default 7d). Message sent does not count.</w:t>
+      </w:r>
+    </w:p>
+    <w:tbl>
+      <w:tblPr>
+        <w:tblW w:type="auto" w:w="0"/>
+        <w:tblLook w:firstColumn="1" w:firstRow="1" w:lastColumn="0" w:lastRow="0" w:noHBand="0" w:noVBand="1" w:val="04A0"/>
+      </w:tblPr>
+      <w:tblGrid>
+        <w:gridCol w:w="4513"/>
+        <w:gridCol w:w="4513"/>
+      </w:tblGrid>
+      <w:tr>
+        <w:tc>
+          <w:tcPr>
+            <w:tcW w:type="dxa" w:w="4513"/>
+          </w:tcPr>
+          <w:p>
+            <w:r>
+              <w:t>Pilot metric (3 churches, 4 wks)</w:t>
+            </w:r>
+          </w:p>
+        </w:tc>
+        <w:tc>
+          <w:tcPr>
+            <w:tcW w:type="dxa" w:w="4513"/>
+          </w:tcPr>
+          <w:p>
+            <w:r>
+              <w:t>Target</w:t>
+            </w:r>
+          </w:p>
+        </w:tc>
+      </w:tr>
+      <w:tr>
+        <w:tc>
+          <w:tcPr>
+            <w:tcW w:type="dxa" w:w="4513"/>
+          </w:tcPr>
+          <w:p>
+            <w:r>
+              <w:t>% new contacts with owner &lt;24h</w:t>
+            </w:r>
+          </w:p>
+        </w:tc>
+        <w:tc>
+          <w:tcPr>
+            <w:tcW w:type="dxa" w:w="4513"/>
+          </w:tcPr>
+          <w:p>
+            <w:r>
+              <w:t>&gt;70%</w:t>
+            </w:r>
+          </w:p>
+        </w:tc>
+      </w:tr>
+      <w:tr>
+        <w:tc>
+          <w:tcPr>
+            <w:tcW w:type="dxa" w:w="4513"/>
+          </w:tcPr>
+          <w:p>
+            <w:r>
+              <w:t>% with interaction &lt;7d (+outcome+next)</w:t>
+            </w:r>
+          </w:p>
+        </w:tc>
+        <w:tc>
+          <w:tcPr>
+            <w:tcW w:type="dxa" w:w="4513"/>
+          </w:tcPr>
+          <w:p>
+            <w:r>
+              <w:t>&gt;50%</w:t>
+            </w:r>
+          </w:p>
+        </w:tc>
+      </w:tr>
+      <w:tr>
+        <w:tc>
+          <w:tcPr>
+            <w:tcW w:type="dxa" w:w="4513"/>
+          </w:tcPr>
+          <w:p>
+            <w:r>
+              <w:t>% captures &lt;2min + phone valid</w:t>
+            </w:r>
+          </w:p>
+        </w:tc>
+        <w:tc>
+          <w:tcPr>
+            <w:tcW w:type="dxa" w:w="4513"/>
+          </w:tcPr>
+          <w:p>
+            <w:r>
+              <w:t>&gt;80%</w:t>
+            </w:r>
+          </w:p>
+        </w:tc>
+      </w:tr>
+      <w:tr>
+        <w:tc>
+          <w:tcPr>
+            <w:tcW w:type="dxa" w:w="4513"/>
+          </w:tcPr>
+          <w:p>
+            <w:r>
+              <w:t>Overdue list shrink week-over-week</w:t>
+            </w:r>
+          </w:p>
+        </w:tc>
+        <w:tc>
+          <w:tcPr>
+            <w:tcW w:type="dxa" w:w="4513"/>
+          </w:tcPr>
+          <w:p>
+            <w:r>
+              <w:t>Yes</w:t>
+            </w:r>
+          </w:p>
+        </w:tc>
+      </w:tr>
+      <w:tr>
+        <w:tc>
+          <w:tcPr>
+            <w:tcW w:type="dxa" w:w="4513"/>
+          </w:tcPr>
+          <w:p>
+            <w:r>
+              <w:t>Zero cross-org reads in tests</w:t>
+            </w:r>
+          </w:p>
+        </w:tc>
+        <w:tc>
+          <w:tcPr>
+            <w:tcW w:type="dxa" w:w="4513"/>
+          </w:tcPr>
+          <w:p>
+            <w:r>
+              <w:t>0</w:t>
+            </w:r>
+          </w:p>
+        </w:tc>
+      </w:tr>
+      <w:tr>
+        <w:tc>
+          <w:tcPr>
+            <w:tcW w:type="dxa" w:w="4513"/>
+          </w:tcPr>
+          <w:p>
+            <w:r>
+              <w:t>Volunteer unassisted after 15-min training</w:t>
+            </w:r>
+          </w:p>
+        </w:tc>
+        <w:tc>
+          <w:tcPr>
+            <w:tcW w:type="dxa" w:w="4513"/>
+          </w:tcPr>
+          <w:p>
+            <w:r>
+              <w:t>Yes</w:t>
+            </w:r>
+          </w:p>
+        </w:tc>
+      </w:tr>
+    </w:tbl>
+    <w:p/>
+    <w:p>
+      <w:r>
+        <w:rPr>
+          <w:b/>
+        </w:rPr>
+        <w:t xml:space="preserve">Gate: </w:t>
+      </w:r>
+      <w:r>
+        <w:t>Kill/rework if both lead metrics miss or capture stays dirty. Do not proceed to P1.</w:t>
+      </w:r>
+    </w:p>
+    <w:p>
+      <w:pPr>
+        <w:pStyle w:val="Heading1"/>
+      </w:pPr>
+      <w:r>
+        <w:t>20. Member Self-Service — MVP Definition (locked)</w:t>
+      </w:r>
+    </w:p>
+    <w:p>
+      <w:r>
+        <w:t>MVP member can ONLY: view own profile, view own connections + next step, edit own channel + interests, request correction. Cannot: search others, see rosters, see other outcomes, self-assign. Expanded self-service is P1. Enforced server-side.</w:t>
+      </w:r>
+    </w:p>
+    <w:p>
+      <w:pPr>
+        <w:pStyle w:val="Heading1"/>
+      </w:pPr>
+      <w:r>
+        <w:t>21. Pricing Test Plan</w:t>
+      </w:r>
+    </w:p>
+    <w:p>
+      <w:r>
+        <w:t>Survey: 9/12 hypothetical yes (5 small monthly, 4 annual), 0 amounts. Run ladder: 2,000 / 5,000 / 10,000 NGN per month per church (or local equivalent); annual = 10x monthly. Ask who signs, budget line, cancel trigger. Success = 2/3 pilots name amount + payer. Optional free tier: 1 org, max 50 people, no support.</w:t>
+      </w:r>
+    </w:p>
+    <w:p>
+      <w:pPr>
+        <w:pStyle w:val="Heading1"/>
+      </w:pPr>
+      <w:r>
+        <w:t>Appendix A — Canonical Journey + Frame Map</w:t>
+      </w:r>
+    </w:p>
+    <w:p>
+      <w:r>
+        <w:t>Full (source of truth): 1 First Contact &gt; 2 Capture &amp; Welcome &gt; 3 Assign &gt; 4 Personal Follow-Up &gt; 5 Record Interaction &gt; 6 Understand &gt; 7 Connect &gt; 8 First Participation &gt; 9 Next Action &gt; 10 Continued Relationship. Shorthand: Capture &gt; Assign &gt; Follow Up &gt; Connect &gt; Know What Happens Next.</w:t>
+      </w:r>
+    </w:p>
+    <w:tbl>
+      <w:tblPr>
+        <w:tblW w:type="auto" w:w="0"/>
+        <w:tblLook w:firstColumn="1" w:firstRow="1" w:lastColumn="0" w:lastRow="0" w:noHBand="0" w:noVBand="1" w:val="04A0"/>
+      </w:tblPr>
+      <w:tblGrid>
+        <w:gridCol w:w="3009"/>
+        <w:gridCol w:w="3009"/>
+        <w:gridCol w:w="3009"/>
+      </w:tblGrid>
+      <w:tr>
+        <w:tc>
+          <w:tcPr>
+            <w:tcW w:type="dxa" w:w="3009"/>
+          </w:tcPr>
+          <w:p>
+            <w:r>
+              <w:t>Stage</w:t>
+            </w:r>
+          </w:p>
+        </w:tc>
+        <w:tc>
+          <w:tcPr>
+            <w:tcW w:type="dxa" w:w="3009"/>
+          </w:tcPr>
+          <w:p>
+            <w:r>
+              <w:t>Prototype P01-P20</w:t>
+            </w:r>
+          </w:p>
+        </w:tc>
+        <w:tc>
+          <w:tcPr>
+            <w:tcW w:type="dxa" w:w="3009"/>
+          </w:tcPr>
+          <w:p>
+            <w:r>
+              <w:t>System F01-F18</w:t>
+            </w:r>
+          </w:p>
+        </w:tc>
+      </w:tr>
+      <w:tr>
+        <w:tc>
+          <w:tcPr>
+            <w:tcW w:type="dxa" w:w="3009"/>
+          </w:tcPr>
+          <w:p>
+            <w:r>
+              <w:t>Login</w:t>
+            </w:r>
+          </w:p>
+        </w:tc>
+        <w:tc>
+          <w:tcPr>
+            <w:tcW w:type="dxa" w:w="3009"/>
+          </w:tcPr>
+          <w:p>
+            <w:r>
+              <w:t>P01</w:t>
+            </w:r>
+          </w:p>
+        </w:tc>
+        <w:tc>
+          <w:tcPr>
+            <w:tcW w:type="dxa" w:w="3009"/>
+          </w:tcPr>
+          <w:p>
+            <w:r>
+              <w:t>F01</w:t>
+            </w:r>
+          </w:p>
+        </w:tc>
+      </w:tr>
+      <w:tr>
+        <w:tc>
+          <w:tcPr>
+            <w:tcW w:type="dxa" w:w="3009"/>
+          </w:tcPr>
+          <w:p>
+            <w:r>
+              <w:t>Home</w:t>
+            </w:r>
+          </w:p>
+        </w:tc>
+        <w:tc>
+          <w:tcPr>
+            <w:tcW w:type="dxa" w:w="3009"/>
+          </w:tcPr>
+          <w:p>
+            <w:r>
+              <w:t>P02 / P20 updated</w:t>
+            </w:r>
+          </w:p>
+        </w:tc>
+        <w:tc>
+          <w:tcPr>
+            <w:tcW w:type="dxa" w:w="3009"/>
+          </w:tcPr>
+          <w:p>
+            <w:r>
+              <w:t>F02</w:t>
+            </w:r>
+          </w:p>
+        </w:tc>
+      </w:tr>
+      <w:tr>
+        <w:tc>
+          <w:tcPr>
+            <w:tcW w:type="dxa" w:w="3009"/>
+          </w:tcPr>
+          <w:p>
+            <w:r>
+              <w:t>People + Create</w:t>
+            </w:r>
+          </w:p>
+        </w:tc>
+        <w:tc>
+          <w:tcPr>
+            <w:tcW w:type="dxa" w:w="3009"/>
+          </w:tcPr>
+          <w:p>
+            <w:r>
+              <w:t>P03-P05</w:t>
+            </w:r>
+          </w:p>
+        </w:tc>
+        <w:tc>
+          <w:tcPr>
+            <w:tcW w:type="dxa" w:w="3009"/>
+          </w:tcPr>
+          <w:p>
+            <w:r>
+              <w:t>F03</w:t>
+            </w:r>
+          </w:p>
+        </w:tc>
+      </w:tr>
+      <w:tr>
+        <w:tc>
+          <w:tcPr>
+            <w:tcW w:type="dxa" w:w="3009"/>
+          </w:tcPr>
+          <w:p>
+            <w:r>
+              <w:t>Assign</w:t>
+            </w:r>
+          </w:p>
+        </w:tc>
+        <w:tc>
+          <w:tcPr>
+            <w:tcW w:type="dxa" w:w="3009"/>
+          </w:tcPr>
+          <w:p>
+            <w:r>
+              <w:t>P06</w:t>
+            </w:r>
+          </w:p>
+        </w:tc>
+        <w:tc>
+          <w:tcPr>
+            <w:tcW w:type="dxa" w:w="3009"/>
+          </w:tcPr>
+          <w:p>
+            <w:r>
+              <w:t>F05</w:t>
+            </w:r>
+          </w:p>
+        </w:tc>
+      </w:tr>
+      <w:tr>
+        <w:tc>
+          <w:tcPr>
+            <w:tcW w:type="dxa" w:w="3009"/>
+          </w:tcPr>
+          <w:p>
+            <w:r>
+              <w:t>Profile</w:t>
+            </w:r>
+          </w:p>
+        </w:tc>
+        <w:tc>
+          <w:tcPr>
+            <w:tcW w:type="dxa" w:w="3009"/>
+          </w:tcPr>
+          <w:p>
+            <w:r>
+              <w:t>P07 / P19 updated</w:t>
+            </w:r>
+          </w:p>
+        </w:tc>
+        <w:tc>
+          <w:tcPr>
+            <w:tcW w:type="dxa" w:w="3009"/>
+          </w:tcPr>
+          <w:p>
+            <w:r>
+              <w:t>F04</w:t>
+            </w:r>
+          </w:p>
+        </w:tc>
+      </w:tr>
+      <w:tr>
+        <w:tc>
+          <w:tcPr>
+            <w:tcW w:type="dxa" w:w="3009"/>
+          </w:tcPr>
+          <w:p>
+            <w:r>
+              <w:t>Action detail/In Progress</w:t>
+            </w:r>
+          </w:p>
+        </w:tc>
+        <w:tc>
+          <w:tcPr>
+            <w:tcW w:type="dxa" w:w="3009"/>
+          </w:tcPr>
+          <w:p>
+            <w:r>
+              <w:t>P08-P09</w:t>
+            </w:r>
+          </w:p>
+        </w:tc>
+        <w:tc>
+          <w:tcPr>
+            <w:tcW w:type="dxa" w:w="3009"/>
+          </w:tcPr>
+          <w:p>
+            <w:r>
+              <w:t>F05</w:t>
+            </w:r>
+          </w:p>
+        </w:tc>
+      </w:tr>
+      <w:tr>
+        <w:tc>
+          <w:tcPr>
+            <w:tcW w:type="dxa" w:w="3009"/>
+          </w:tcPr>
+          <w:p>
+            <w:r>
+              <w:t>Record/Recorded</w:t>
+            </w:r>
+          </w:p>
+        </w:tc>
+        <w:tc>
+          <w:tcPr>
+            <w:tcW w:type="dxa" w:w="3009"/>
+          </w:tcPr>
+          <w:p>
+            <w:r>
+              <w:t>P10-P11</w:t>
+            </w:r>
+          </w:p>
+        </w:tc>
+        <w:tc>
+          <w:tcPr>
+            <w:tcW w:type="dxa" w:w="3009"/>
+          </w:tcPr>
+          <w:p>
+            <w:r>
+              <w:t>F05</w:t>
+            </w:r>
+          </w:p>
+        </w:tc>
+      </w:tr>
+      <w:tr>
+        <w:tc>
+          <w:tcPr>
+            <w:tcW w:type="dxa" w:w="3009"/>
+          </w:tcPr>
+          <w:p>
+            <w:r>
+              <w:t>Journey</w:t>
+            </w:r>
+          </w:p>
+        </w:tc>
+        <w:tc>
+          <w:tcPr>
+            <w:tcW w:type="dxa" w:w="3009"/>
+          </w:tcPr>
+          <w:p>
+            <w:r>
+              <w:t>P12</w:t>
+            </w:r>
+          </w:p>
+        </w:tc>
+        <w:tc>
+          <w:tcPr>
+            <w:tcW w:type="dxa" w:w="3009"/>
+          </w:tcPr>
+          <w:p>
+            <w:r>
+              <w:t>F04</w:t>
+            </w:r>
+          </w:p>
+        </w:tc>
+      </w:tr>
+      <w:tr>
+        <w:tc>
+          <w:tcPr>
+            <w:tcW w:type="dxa" w:w="3009"/>
+          </w:tcPr>
+          <w:p>
+            <w:r>
+              <w:t>Suggest/Intro/Sent</w:t>
+            </w:r>
+          </w:p>
+        </w:tc>
+        <w:tc>
+          <w:tcPr>
+            <w:tcW w:type="dxa" w:w="3009"/>
+          </w:tcPr>
+          <w:p>
+            <w:r>
+              <w:t>P13-P15</w:t>
+            </w:r>
+          </w:p>
+        </w:tc>
+        <w:tc>
+          <w:tcPr>
+            <w:tcW w:type="dxa" w:w="3009"/>
+          </w:tcPr>
+          <w:p>
+            <w:r>
+              <w:t>F06</w:t>
+            </w:r>
+          </w:p>
+        </w:tc>
+      </w:tr>
+      <w:tr>
+        <w:tc>
+          <w:tcPr>
+            <w:tcW w:type="dxa" w:w="3009"/>
+          </w:tcPr>
+          <w:p>
+            <w:r>
+              <w:t>Participation/Confirmed</w:t>
+            </w:r>
+          </w:p>
+        </w:tc>
+        <w:tc>
+          <w:tcPr>
+            <w:tcW w:type="dxa" w:w="3009"/>
+          </w:tcPr>
+          <w:p>
+            <w:r>
+              <w:t>P16-P17</w:t>
+            </w:r>
+          </w:p>
+        </w:tc>
+        <w:tc>
+          <w:tcPr>
+            <w:tcW w:type="dxa" w:w="3009"/>
+          </w:tcPr>
+          <w:p>
+            <w:r>
+              <w:t>F06</w:t>
+            </w:r>
+          </w:p>
+        </w:tc>
+      </w:tr>
+      <w:tr>
+        <w:tc>
+          <w:tcPr>
+            <w:tcW w:type="dxa" w:w="3009"/>
+          </w:tcPr>
+          <w:p>
+            <w:r>
+              <w:t>Next Action</w:t>
+            </w:r>
+          </w:p>
+        </w:tc>
+        <w:tc>
+          <w:tcPr>
+            <w:tcW w:type="dxa" w:w="3009"/>
+          </w:tcPr>
+          <w:p>
+            <w:r>
+              <w:t>P18</w:t>
+            </w:r>
+          </w:p>
+        </w:tc>
+        <w:tc>
+          <w:tcPr>
+            <w:tcW w:type="dxa" w:w="3009"/>
+          </w:tcPr>
+          <w:p>
+            <w:r>
+              <w:t>F05</w:t>
+            </w:r>
+          </w:p>
+        </w:tc>
+      </w:tr>
+    </w:tbl>
+    <w:p/>
+    <w:p>
+      <w:r>
+        <w:t>P19/P20 are state variants of P07/P02. F08 care, F09 celebrations, F12 insights, F13 AI are FUTURE-DO-NOT-BUILD in MVP.</w:t>
+      </w:r>
+    </w:p>
+    <w:p>
+      <w:pPr>
+        <w:pStyle w:val="Heading1"/>
+      </w:pPr>
+      <w:r>
+        <w:t>Appendix B — Permission Matrix (backend enforces)</w:t>
+      </w:r>
+    </w:p>
+    <w:tbl>
+      <w:tblPr>
+        <w:tblW w:type="auto" w:w="0"/>
+        <w:tblLook w:firstColumn="1" w:firstRow="1" w:lastColumn="0" w:lastRow="0" w:noHBand="0" w:noVBand="1" w:val="04A0"/>
+      </w:tblPr>
+      <w:tblGrid>
+        <w:gridCol w:w="1289"/>
+        <w:gridCol w:w="1289"/>
+        <w:gridCol w:w="1289"/>
+        <w:gridCol w:w="1289"/>
+        <w:gridCol w:w="1289"/>
+        <w:gridCol w:w="1289"/>
+        <w:gridCol w:w="1289"/>
+      </w:tblGrid>
+      <w:tr>
+        <w:tc>
+          <w:tcPr>
+            <w:tcW w:type="dxa" w:w="1289"/>
+          </w:tcPr>
+          <w:p>
+            <w:r>
+              <w:t>Capability</w:t>
+            </w:r>
+          </w:p>
+        </w:tc>
+        <w:tc>
+          <w:tcPr>
+            <w:tcW w:type="dxa" w:w="1289"/>
+          </w:tcPr>
+          <w:p>
+            <w:r>
+              <w:t>Admin</w:t>
+            </w:r>
+          </w:p>
+        </w:tc>
+        <w:tc>
+          <w:tcPr>
+            <w:tcW w:type="dxa" w:w="1289"/>
+          </w:tcPr>
+          <w:p>
+            <w:r>
+              <w:t>Worker</w:t>
+            </w:r>
+          </w:p>
+        </w:tc>
+        <w:tc>
+          <w:tcPr>
+            <w:tcW w:type="dxa" w:w="1289"/>
+          </w:tcPr>
+          <w:p>
+            <w:r>
+              <w:t>Group Leader</w:t>
+            </w:r>
+          </w:p>
+        </w:tc>
+        <w:tc>
+          <w:tcPr>
+            <w:tcW w:type="dxa" w:w="1289"/>
+          </w:tcPr>
+          <w:p>
+            <w:r>
+              <w:t>Member</w:t>
+            </w:r>
+          </w:p>
+        </w:tc>
+        <w:tc>
+          <w:tcPr>
+            <w:tcW w:type="dxa" w:w="1289"/>
+          </w:tcPr>
+          <w:p>
+            <w:r>
+              <w:t>Care(P1)</w:t>
+            </w:r>
+          </w:p>
+        </w:tc>
+        <w:tc>
+          <w:tcPr>
+            <w:tcW w:type="dxa" w:w="1289"/>
+          </w:tcPr>
+          <w:p>
+            <w:r>
+              <w:t>Senior</w:t>
+            </w:r>
+          </w:p>
+        </w:tc>
+      </w:tr>
+      <w:tr>
+        <w:tc>
+          <w:tcPr>
+            <w:tcW w:type="dxa" w:w="1289"/>
+          </w:tcPr>
+          <w:p>
+            <w:r>
+              <w:t>Org/users/roles</w:t>
+            </w:r>
+          </w:p>
+        </w:tc>
+        <w:tc>
+          <w:tcPr>
+            <w:tcW w:type="dxa" w:w="1289"/>
+          </w:tcPr>
+          <w:p>
+            <w:r>
+              <w:t>CRUD</w:t>
+            </w:r>
+          </w:p>
+        </w:tc>
+        <w:tc>
+          <w:tcPr>
+            <w:tcW w:type="dxa" w:w="1289"/>
+          </w:tcPr>
+          <w:p>
+            <w:r>
+              <w:t>own</w:t>
+            </w:r>
+          </w:p>
+        </w:tc>
+        <w:tc>
+          <w:tcPr>
+            <w:tcW w:type="dxa" w:w="1289"/>
+          </w:tcPr>
+          <w:p>
+            <w:r>
+              <w:t>own</w:t>
+            </w:r>
+          </w:p>
+        </w:tc>
+        <w:tc>
+          <w:tcPr>
+            <w:tcW w:type="dxa" w:w="1289"/>
+          </w:tcPr>
+          <w:p>
+            <w:r>
+              <w:t>own</w:t>
+            </w:r>
+          </w:p>
+        </w:tc>
+        <w:tc>
+          <w:tcPr>
+            <w:tcW w:type="dxa" w:w="1289"/>
+          </w:tcPr>
+          <w:p>
+            <w:r>
+              <w:t>own</w:t>
+            </w:r>
+          </w:p>
+        </w:tc>
+        <w:tc>
+          <w:tcPr>
+            <w:tcW w:type="dxa" w:w="1289"/>
+          </w:tcPr>
+          <w:p>
+            <w:r>
+              <w:t>read org</w:t>
+            </w:r>
+          </w:p>
+        </w:tc>
+      </w:tr>
+      <w:tr>
+        <w:tc>
+          <w:tcPr>
+            <w:tcW w:type="dxa" w:w="1289"/>
+          </w:tcPr>
+          <w:p>
+            <w:r>
+              <w:t>People</w:t>
+            </w:r>
+          </w:p>
+        </w:tc>
+        <w:tc>
+          <w:tcPr>
+            <w:tcW w:type="dxa" w:w="1289"/>
+          </w:tcPr>
+          <w:p>
+            <w:r>
+              <w:t>create org*</w:t>
+            </w:r>
+          </w:p>
+        </w:tc>
+        <w:tc>
+          <w:tcPr>
+            <w:tcW w:type="dxa" w:w="1289"/>
+          </w:tcPr>
+          <w:p>
+            <w:r>
+              <w:t>assigned+shared</w:t>
+            </w:r>
+          </w:p>
+        </w:tc>
+        <w:tc>
+          <w:tcPr>
+            <w:tcW w:type="dxa" w:w="1289"/>
+          </w:tcPr>
+          <w:p>
+            <w:r>
+              <w:t>group scope</w:t>
+            </w:r>
+          </w:p>
+        </w:tc>
+        <w:tc>
+          <w:tcPr>
+            <w:tcW w:type="dxa" w:w="1289"/>
+          </w:tcPr>
+          <w:p>
+            <w:r>
+              <w:t>own read</w:t>
+            </w:r>
+          </w:p>
+        </w:tc>
+        <w:tc>
+          <w:tcPr>
+            <w:tcW w:type="dxa" w:w="1289"/>
+          </w:tcPr>
+          <w:p>
+            <w:r>
+              <w:t>as assigned</w:t>
+            </w:r>
+          </w:p>
+        </w:tc>
+        <w:tc>
+          <w:tcPr>
+            <w:tcW w:type="dxa" w:w="1289"/>
+          </w:tcPr>
+          <w:p>
+            <w:r>
+              <w:t>search read</w:t>
+            </w:r>
+          </w:p>
+        </w:tc>
+      </w:tr>
+      <w:tr>
+        <w:tc>
+          <w:tcPr>
+            <w:tcW w:type="dxa" w:w="1289"/>
+          </w:tcPr>
+          <w:p>
+            <w:r>
+              <w:t>PII</w:t>
+            </w:r>
+          </w:p>
+        </w:tc>
+        <w:tc>
+          <w:tcPr>
+            <w:tcW w:type="dxa" w:w="1289"/>
+          </w:tcPr>
+          <w:p>
+            <w:r>
+              <w:t>only with scope</w:t>
+            </w:r>
+          </w:p>
+        </w:tc>
+        <w:tc>
+          <w:tcPr>
+            <w:tcW w:type="dxa" w:w="1289"/>
+          </w:tcPr>
+          <w:p>
+            <w:r>
+              <w:t>full if assigned</w:t>
+            </w:r>
+          </w:p>
+        </w:tc>
+        <w:tc>
+          <w:tcPr>
+            <w:tcW w:type="dxa" w:w="1289"/>
+          </w:tcPr>
+          <w:p>
+            <w:r>
+              <w:t>relevant no care</w:t>
+            </w:r>
+          </w:p>
+        </w:tc>
+        <w:tc>
+          <w:tcPr>
+            <w:tcW w:type="dxa" w:w="1289"/>
+          </w:tcPr>
+          <w:p>
+            <w:r>
+              <w:t>own</w:t>
+            </w:r>
+          </w:p>
+        </w:tc>
+        <w:tc>
+          <w:tcPr>
+            <w:tcW w:type="dxa" w:w="1289"/>
+          </w:tcPr>
+          <w:p>
+            <w:r>
+              <w:t>if assigned</w:t>
+            </w:r>
+          </w:p>
+        </w:tc>
+        <w:tc>
+          <w:tcPr>
+            <w:tcW w:type="dxa" w:w="1289"/>
+          </w:tcPr>
+          <w:p>
+            <w:r>
+              <w:t>no care</w:t>
+            </w:r>
+          </w:p>
+        </w:tc>
+      </w:tr>
+      <w:tr>
+        <w:tc>
+          <w:tcPr>
+            <w:tcW w:type="dxa" w:w="1289"/>
+          </w:tcPr>
+          <w:p>
+            <w:r>
+              <w:t>Actions</w:t>
+            </w:r>
+          </w:p>
+        </w:tc>
+        <w:tc>
+          <w:tcPr>
+            <w:tcW w:type="dxa" w:w="1289"/>
+          </w:tcPr>
+          <w:p>
+            <w:r>
+              <w:t>admin only</w:t>
+            </w:r>
+          </w:p>
+        </w:tc>
+        <w:tc>
+          <w:tcPr>
+            <w:tcW w:type="dxa" w:w="1289"/>
+          </w:tcPr>
+          <w:p>
+            <w:r>
+              <w:t>CRUD assigned</w:t>
+            </w:r>
+          </w:p>
+        </w:tc>
+        <w:tc>
+          <w:tcPr>
+            <w:tcW w:type="dxa" w:w="1289"/>
+          </w:tcPr>
+          <w:p>
+            <w:r>
+              <w:t>CRUD group</w:t>
+            </w:r>
+          </w:p>
+        </w:tc>
+        <w:tc>
+          <w:tcPr>
+            <w:tcW w:type="dxa" w:w="1289"/>
+          </w:tcPr>
+          <w:p>
+            <w:r>
+              <w:t>complete own</w:t>
+            </w:r>
+          </w:p>
+        </w:tc>
+        <w:tc>
+          <w:tcPr>
+            <w:tcW w:type="dxa" w:w="1289"/>
+          </w:tcPr>
+          <w:p>
+            <w:r>
+              <w:t>care-linked</w:t>
+            </w:r>
+          </w:p>
+        </w:tc>
+        <w:tc>
+          <w:tcPr>
+            <w:tcW w:type="dxa" w:w="1289"/>
+          </w:tcPr>
+          <w:p>
+            <w:r>
+              <w:t>read</w:t>
+            </w:r>
+          </w:p>
+        </w:tc>
+      </w:tr>
+      <w:tr>
+        <w:tc>
+          <w:tcPr>
+            <w:tcW w:type="dxa" w:w="1289"/>
+          </w:tcPr>
+          <w:p>
+            <w:r>
+              <w:t>Interactions</w:t>
+            </w:r>
+          </w:p>
+        </w:tc>
+        <w:tc>
+          <w:tcPr>
+            <w:tcW w:type="dxa" w:w="1289"/>
+          </w:tcPr>
+          <w:p>
+            <w:r>
+              <w:t>if authorised</w:t>
+            </w:r>
+          </w:p>
+        </w:tc>
+        <w:tc>
+          <w:tcPr>
+            <w:tcW w:type="dxa" w:w="1289"/>
+          </w:tcPr>
+          <w:p>
+            <w:r>
+              <w:t>if assigned</w:t>
+            </w:r>
+          </w:p>
+        </w:tc>
+        <w:tc>
+          <w:tcPr>
+            <w:tcW w:type="dxa" w:w="1289"/>
+          </w:tcPr>
+          <w:p>
+            <w:r>
+              <w:t>if group</w:t>
+            </w:r>
+          </w:p>
+        </w:tc>
+        <w:tc>
+          <w:tcPr>
+            <w:tcW w:type="dxa" w:w="1289"/>
+          </w:tcPr>
+          <w:p>
+            <w:r>
+              <w:t>none</w:t>
+            </w:r>
+          </w:p>
+        </w:tc>
+        <w:tc>
+          <w:tcPr>
+            <w:tcW w:type="dxa" w:w="1289"/>
+          </w:tcPr>
+          <w:p>
+            <w:r>
+              <w:t>if assigned</w:t>
+            </w:r>
+          </w:p>
+        </w:tc>
+        <w:tc>
+          <w:tcPr>
+            <w:tcW w:type="dxa" w:w="1289"/>
+          </w:tcPr>
+          <w:p>
+            <w:r>
+              <w:t>read</w:t>
+            </w:r>
+          </w:p>
+        </w:tc>
+      </w:tr>
+      <w:tr>
+        <w:tc>
+          <w:tcPr>
+            <w:tcW w:type="dxa" w:w="1289"/>
+          </w:tcPr>
+          <w:p>
+            <w:r>
+              <w:t>Groups/intro</w:t>
+            </w:r>
+          </w:p>
+        </w:tc>
+        <w:tc>
+          <w:tcPr>
+            <w:tcW w:type="dxa" w:w="1289"/>
+          </w:tcPr>
+          <w:p>
+            <w:r>
+              <w:t>config</w:t>
+            </w:r>
+          </w:p>
+        </w:tc>
+        <w:tc>
+          <w:tcPr>
+            <w:tcW w:type="dxa" w:w="1289"/>
+          </w:tcPr>
+          <w:p>
+            <w:r>
+              <w:t>if assigned</w:t>
+            </w:r>
+          </w:p>
+        </w:tc>
+        <w:tc>
+          <w:tcPr>
+            <w:tcW w:type="dxa" w:w="1289"/>
+          </w:tcPr>
+          <w:p>
+            <w:r>
+              <w:t>if group</w:t>
+            </w:r>
+          </w:p>
+        </w:tc>
+        <w:tc>
+          <w:tcPr>
+            <w:tcW w:type="dxa" w:w="1289"/>
+          </w:tcPr>
+          <w:p>
+            <w:r>
+              <w:t>view own</w:t>
+            </w:r>
+          </w:p>
+        </w:tc>
+        <w:tc>
+          <w:tcPr>
+            <w:tcW w:type="dxa" w:w="1289"/>
+          </w:tcPr>
+          <w:p>
+            <w:r>
+              <w:t>none</w:t>
+            </w:r>
+          </w:p>
+        </w:tc>
+        <w:tc>
+          <w:tcPr>
+            <w:tcW w:type="dxa" w:w="1289"/>
+          </w:tcPr>
+          <w:p>
+            <w:r>
+              <w:t>read</w:t>
+            </w:r>
+          </w:p>
+        </w:tc>
+      </w:tr>
+      <w:tr>
+        <w:tc>
+          <w:tcPr>
+            <w:tcW w:type="dxa" w:w="1289"/>
+          </w:tcPr>
+          <w:p>
+            <w:r>
+              <w:t>Notifications</w:t>
+            </w:r>
+          </w:p>
+        </w:tc>
+        <w:tc>
+          <w:tcPr>
+            <w:tcW w:type="dxa" w:w="1289"/>
+          </w:tcPr>
+          <w:p>
+            <w:r>
+              <w:t>org+admin</w:t>
+            </w:r>
+          </w:p>
+        </w:tc>
+        <w:tc>
+          <w:tcPr>
+            <w:tcW w:type="dxa" w:w="1289"/>
+          </w:tcPr>
+          <w:p>
+            <w:r>
+              <w:t>assigned</w:t>
+            </w:r>
+          </w:p>
+        </w:tc>
+        <w:tc>
+          <w:tcPr>
+            <w:tcW w:type="dxa" w:w="1289"/>
+          </w:tcPr>
+          <w:p>
+            <w:r>
+              <w:t>group</w:t>
+            </w:r>
+          </w:p>
+        </w:tc>
+        <w:tc>
+          <w:tcPr>
+            <w:tcW w:type="dxa" w:w="1289"/>
+          </w:tcPr>
+          <w:p>
+            <w:r>
+              <w:t>own</w:t>
+            </w:r>
+          </w:p>
+        </w:tc>
+        <w:tc>
+          <w:tcPr>
+            <w:tcW w:type="dxa" w:w="1289"/>
+          </w:tcPr>
+          <w:p>
+            <w:r>
+              <w:t>care-assigned</w:t>
+            </w:r>
+          </w:p>
+        </w:tc>
+        <w:tc>
+          <w:tcPr>
+            <w:tcW w:type="dxa" w:w="1289"/>
+          </w:tcPr>
+          <w:p>
+            <w:r>
+              <w:t>aggregate no PII</w:t>
+            </w:r>
+          </w:p>
+        </w:tc>
+      </w:tr>
+      <w:tr>
+        <w:tc>
+          <w:tcPr>
+            <w:tcW w:type="dxa" w:w="1289"/>
+          </w:tcPr>
+          <w:p>
+            <w:r>
+              <w:t>Care Restricted</w:t>
+            </w:r>
+          </w:p>
+        </w:tc>
+        <w:tc>
+          <w:tcPr>
+            <w:tcW w:type="dxa" w:w="1289"/>
+          </w:tcPr>
+          <w:p>
+            <w:r>
+              <w:t>denied</w:t>
+            </w:r>
+          </w:p>
+        </w:tc>
+        <w:tc>
+          <w:tcPr>
+            <w:tcW w:type="dxa" w:w="1289"/>
+          </w:tcPr>
+          <w:p>
+            <w:r>
+              <w:t>denied</w:t>
+            </w:r>
+          </w:p>
+        </w:tc>
+        <w:tc>
+          <w:tcPr>
+            <w:tcW w:type="dxa" w:w="1289"/>
+          </w:tcPr>
+          <w:p>
+            <w:r>
+              <w:t>denied</w:t>
+            </w:r>
+          </w:p>
+        </w:tc>
+        <w:tc>
+          <w:tcPr>
+            <w:tcW w:type="dxa" w:w="1289"/>
+          </w:tcPr>
+          <w:p>
+            <w:r>
+              <w:t>own req</w:t>
+            </w:r>
+          </w:p>
+        </w:tc>
+        <w:tc>
+          <w:tcPr>
+            <w:tcW w:type="dxa" w:w="1289"/>
+          </w:tcPr>
+          <w:p>
+            <w:r>
+              <w:t>if assigned</w:t>
+            </w:r>
+          </w:p>
+        </w:tc>
+        <w:tc>
+          <w:tcPr>
+            <w:tcW w:type="dxa" w:w="1289"/>
+          </w:tcPr>
+          <w:p>
+            <w:r>
+              <w:t>denied</w:t>
+            </w:r>
+          </w:p>
+        </w:tc>
+      </w:tr>
+    </w:tbl>
+    <w:p/>
+    <w:p>
+      <w:r>
+        <w:t>Org-wide People search off by default; explicit grant required. UI hiding is not enforcement.</w:t>
+      </w:r>
+    </w:p>
+    <w:p>
+      <w:r>
+        <w:t>ROE — No one lost to silence.</w:t>
+      </w:r>
+    </w:p>
     <w:sectPr>
       <w:pgSz w:w="11906" w:h="16838"/>
       <w:pgMar w:top="1440" w:right="1440" w:bottom="1440" w:left="1440" w:header="708" w:footer="708" w:gutter="0"/>

</xml_diff>